<commit_message>
add new templates and functions
</commit_message>
<xml_diff>
--- a/SzakdolgozatErtekeloApi/Templates/BiralatiLapTemplate.docx
+++ b/SzakdolgozatErtekeloApi/Templates/BiralatiLapTemplate.docx
@@ -244,7 +244,23 @@
           <w:rFonts w:ascii="Times New Roman" w:hAnsi="Times New Roman" w:cs="Times New Roman"/>
           <w:b/>
         </w:rPr>
-        <w:t>A hallgató Neptun kódja:</w:t>
+        <w:t xml:space="preserve">A hallgató </w:t>
+      </w:r>
+      <w:proofErr w:type="spellStart"/>
+      <w:r>
+        <w:rPr>
+          <w:rFonts w:ascii="Times New Roman" w:hAnsi="Times New Roman" w:cs="Times New Roman"/>
+          <w:b/>
+        </w:rPr>
+        <w:t>Neptun</w:t>
+      </w:r>
+      <w:proofErr w:type="spellEnd"/>
+      <w:r>
+        <w:rPr>
+          <w:rFonts w:ascii="Times New Roman" w:hAnsi="Times New Roman" w:cs="Times New Roman"/>
+          <w:b/>
+        </w:rPr>
+        <w:t xml:space="preserve"> kódja:</w:t>
       </w:r>
       <w:r>
         <w:rPr>
@@ -331,6 +347,18 @@
     </w:p>
     <w:p>
       <w:pPr>
+        <w:tabs>
+          <w:tab w:val="left" w:pos="708"/>
+          <w:tab w:val="left" w:pos="1416"/>
+          <w:tab w:val="left" w:pos="3261"/>
+          <w:tab w:val="left" w:pos="3544"/>
+          <w:tab w:val="left" w:pos="4248"/>
+          <w:tab w:val="left" w:pos="4956"/>
+          <w:tab w:val="left" w:pos="5664"/>
+          <w:tab w:val="left" w:pos="6372"/>
+          <w:tab w:val="left" w:pos="7080"/>
+          <w:tab w:val="left" w:pos="8180"/>
+        </w:tabs>
         <w:ind w:left="3119" w:hanging="3119"/>
         <w:rPr>
           <w:bCs/>
@@ -381,11 +409,11 @@
         <w:tblLook w:val="04A0" w:firstRow="1" w:lastRow="0" w:firstColumn="1" w:lastColumn="0" w:noHBand="0" w:noVBand="1"/>
       </w:tblPr>
       <w:tblGrid>
-        <w:gridCol w:w="1778"/>
-        <w:gridCol w:w="1803"/>
-        <w:gridCol w:w="1624"/>
-        <w:gridCol w:w="1221"/>
-        <w:gridCol w:w="1428"/>
+        <w:gridCol w:w="1793"/>
+        <w:gridCol w:w="1818"/>
+        <w:gridCol w:w="1634"/>
+        <w:gridCol w:w="1177"/>
+        <w:gridCol w:w="1432"/>
         <w:gridCol w:w="1221"/>
       </w:tblGrid>
       <w:tr>
@@ -640,6 +668,8 @@
                 <w:r>
                   <w:rPr>
                     <w:rStyle w:val="Helyrzszveg"/>
+                    <w:sz w:val="18"/>
+                    <w:szCs w:val="18"/>
                   </w:rPr>
                   <w:t>Szöveg beírásához kattintson vagy koppintson ide.</w:t>
                 </w:r>
@@ -676,6 +706,8 @@
                 <w:r>
                   <w:rPr>
                     <w:rStyle w:val="Helyrzszveg"/>
+                    <w:sz w:val="18"/>
+                    <w:szCs w:val="18"/>
                   </w:rPr>
                   <w:t>Szöveg beírásához kattintson vagy koppintson ide.</w:t>
                 </w:r>
@@ -712,6 +744,8 @@
                 <w:r>
                   <w:rPr>
                     <w:rStyle w:val="Helyrzszveg"/>
+                    <w:sz w:val="18"/>
+                    <w:szCs w:val="18"/>
                   </w:rPr>
                   <w:t>Szöveg beírásához kattintson vagy koppintson ide.</w:t>
                 </w:r>
@@ -748,6 +782,8 @@
                 <w:r>
                   <w:rPr>
                     <w:rStyle w:val="Helyrzszveg"/>
+                    <w:sz w:val="18"/>
+                    <w:szCs w:val="18"/>
                   </w:rPr>
                   <w:t>Szöveg beírásához kattintson vagy koppintson ide.</w:t>
                 </w:r>
@@ -784,6 +820,8 @@
                 <w:r>
                   <w:rPr>
                     <w:rStyle w:val="Helyrzszveg"/>
+                    <w:sz w:val="18"/>
+                    <w:szCs w:val="18"/>
                   </w:rPr>
                   <w:t>Szöveg beírásához kattintson vagy koppintson ide.</w:t>
                 </w:r>
@@ -1375,6 +1413,16 @@
       </w:tr>
     </w:tbl>
     <w:p>
+      <w:pPr>
+        <w:tabs>
+          <w:tab w:val="left" w:pos="7551"/>
+        </w:tabs>
+        <w:rPr>
+          <w:rFonts w:ascii="Times New Roman" w:hAnsi="Times New Roman" w:cs="Times New Roman"/>
+          <w:sz w:val="18"/>
+          <w:szCs w:val="18"/>
+        </w:rPr>
+      </w:pPr>
       <w:r>
         <w:rPr>
           <w:rFonts w:ascii="Times New Roman" w:hAnsi="Times New Roman" w:cs="Times New Roman"/>
@@ -1415,35 +1463,14 @@
           </w:r>
         </w:sdtContent>
       </w:sdt>
-    </w:p>
-    <w:p>
-      <w:pPr>
-        <w:rPr>
-          <w:rFonts w:ascii="Times New Roman" w:hAnsi="Times New Roman" w:cs="Times New Roman"/>
-        </w:rPr>
-      </w:pPr>
-    </w:p>
-    <w:p>
-      <w:pPr>
-        <w:suppressAutoHyphens w:val="0"/>
-        <w:spacing w:after="160" w:line="259" w:lineRule="auto"/>
-        <w:rPr>
-          <w:rFonts w:ascii="Times New Roman" w:hAnsi="Times New Roman" w:cs="Times New Roman"/>
-        </w:rPr>
-      </w:pPr>
       <w:r>
         <w:rPr>
           <w:rFonts w:ascii="Times New Roman" w:hAnsi="Times New Roman" w:cs="Times New Roman"/>
-        </w:rPr>
-        <w:br w:type="page"/>
+          <w:sz w:val="18"/>
+          <w:szCs w:val="18"/>
+        </w:rPr>
+        <w:tab/>
       </w:r>
-    </w:p>
-    <w:p>
-      <w:pPr>
-        <w:rPr>
-          <w:rFonts w:ascii="Times New Roman" w:hAnsi="Times New Roman" w:cs="Times New Roman"/>
-        </w:rPr>
-      </w:pPr>
     </w:p>
     <w:tbl>
       <w:tblPr>
@@ -1938,6 +1965,16 @@
       </w:tr>
     </w:tbl>
     <w:p>
+      <w:pPr>
+        <w:tabs>
+          <w:tab w:val="left" w:pos="7110"/>
+        </w:tabs>
+        <w:rPr>
+          <w:rFonts w:ascii="Times New Roman" w:hAnsi="Times New Roman" w:cs="Times New Roman"/>
+          <w:sz w:val="18"/>
+          <w:szCs w:val="18"/>
+        </w:rPr>
+      </w:pPr>
       <w:r>
         <w:rPr>
           <w:rFonts w:ascii="Times New Roman" w:hAnsi="Times New Roman" w:cs="Times New Roman"/>
@@ -1978,19 +2015,40 @@
           </w:r>
         </w:sdtContent>
       </w:sdt>
+      <w:r>
+        <w:rPr>
+          <w:rFonts w:ascii="Times New Roman" w:hAnsi="Times New Roman" w:cs="Times New Roman"/>
+          <w:sz w:val="18"/>
+          <w:szCs w:val="18"/>
+        </w:rPr>
+        <w:tab/>
+      </w:r>
     </w:p>
     <w:p>
       <w:pPr>
-        <w:rPr>
-          <w:rFonts w:ascii="Times New Roman" w:hAnsi="Times New Roman" w:cs="Times New Roman"/>
+        <w:suppressAutoHyphens w:val="0"/>
+        <w:spacing w:after="160" w:line="259" w:lineRule="auto"/>
+        <w:rPr>
+          <w:rFonts w:ascii="Times New Roman" w:hAnsi="Times New Roman" w:cs="Times New Roman"/>
+          <w:sz w:val="18"/>
+          <w:szCs w:val="18"/>
         </w:rPr>
       </w:pPr>
+      <w:r>
+        <w:rPr>
+          <w:rFonts w:ascii="Times New Roman" w:hAnsi="Times New Roman" w:cs="Times New Roman"/>
+          <w:sz w:val="18"/>
+          <w:szCs w:val="18"/>
+        </w:rPr>
+        <w:lastRenderedPageBreak/>
+        <w:br w:type="page"/>
+      </w:r>
     </w:p>
     <w:p>
       <w:pPr>
-        <w:rPr>
-          <w:rFonts w:ascii="Times New Roman" w:hAnsi="Times New Roman" w:cs="Times New Roman"/>
-        </w:rPr>
+        <w:tabs>
+          <w:tab w:val="left" w:pos="7110"/>
+        </w:tabs>
       </w:pPr>
     </w:p>
     <w:tbl>
@@ -5781,7 +5839,6 @@
           <w:sz w:val="18"/>
           <w:szCs w:val="18"/>
         </w:rPr>
-        <w:lastRenderedPageBreak/>
         <w:t>Rövid indoklás (opcionális):</w:t>
       </w:r>
       <w:r>
@@ -6346,7 +6403,7 @@
         <w:rPr>
           <w:rFonts w:ascii="Times New Roman" w:hAnsi="Times New Roman" w:cs="Times New Roman"/>
         </w:rPr>
-        <w:t xml:space="preserve">           számmal:</w:t>
+        <w:t xml:space="preserve">    számmal:</w:t>
       </w:r>
       <w:r>
         <w:rPr>
@@ -6383,27 +6440,56 @@
         </w:rPr>
       </w:pPr>
     </w:p>
-    <w:sdt>
-      <w:sdtPr>
-        <w:tag w:val="Datum"/>
-        <w:id w:val="-56324277"/>
-        <w:placeholder>
-          <w:docPart w:val="DefaultPlaceholder_-1854013440"/>
-        </w:placeholder>
-        <w:showingPlcHdr/>
-        <w15:color w:val="000000"/>
-      </w:sdtPr>
-      <w:sdtContent>
-        <w:p>
+    <w:p>
+      <w:pPr>
+        <w:tabs>
+          <w:tab w:val="left" w:pos="6040"/>
+        </w:tabs>
+      </w:pPr>
+      <w:sdt>
+        <w:sdtPr>
+          <w:tag w:val="Datum"/>
+          <w:id w:val="-56324277"/>
+          <w:placeholder>
+            <w:docPart w:val="DefaultPlaceholder_-1854013440"/>
+          </w:placeholder>
+          <w:showingPlcHdr/>
+          <w15:color w:val="000000"/>
+        </w:sdtPr>
+        <w:sdtContent>
           <w:r>
             <w:rPr>
               <w:rStyle w:val="Helyrzszveg"/>
             </w:rPr>
             <w:t>Szöveg beírásához kattintson vagy koppintson ide.</w:t>
           </w:r>
-        </w:p>
-      </w:sdtContent>
-    </w:sdt>
+        </w:sdtContent>
+      </w:sdt>
+      <w:r>
+        <w:tab/>
+      </w:r>
+    </w:p>
+    <w:p>
+      <w:pPr>
+        <w:tabs>
+          <w:tab w:val="left" w:pos="6040"/>
+        </w:tabs>
+      </w:pPr>
+    </w:p>
+    <w:p>
+      <w:pPr>
+        <w:tabs>
+          <w:tab w:val="left" w:pos="6040"/>
+        </w:tabs>
+      </w:pPr>
+    </w:p>
+    <w:p>
+      <w:pPr>
+        <w:tabs>
+          <w:tab w:val="left" w:pos="6040"/>
+        </w:tabs>
+      </w:pPr>
+    </w:p>
     <w:p>
       <w:pPr>
         <w:jc w:val="right"/>
@@ -7717,20 +7803,36 @@
     <w:rsid w:val="000210FB"/>
     <w:rsid w:val="00065923"/>
     <w:rsid w:val="001D3AB5"/>
+    <w:rsid w:val="001F29C6"/>
+    <w:rsid w:val="002D710F"/>
     <w:rsid w:val="00345868"/>
+    <w:rsid w:val="004F3C2E"/>
+    <w:rsid w:val="0051733E"/>
+    <w:rsid w:val="005E15B5"/>
     <w:rsid w:val="005F43D1"/>
+    <w:rsid w:val="006D6227"/>
+    <w:rsid w:val="00724821"/>
+    <w:rsid w:val="00752819"/>
     <w:rsid w:val="0078442C"/>
     <w:rsid w:val="00926C40"/>
+    <w:rsid w:val="00AC4FF9"/>
     <w:rsid w:val="00B77364"/>
+    <w:rsid w:val="00B920C6"/>
+    <w:rsid w:val="00BD6B00"/>
     <w:rsid w:val="00BF0374"/>
+    <w:rsid w:val="00BF2C50"/>
     <w:rsid w:val="00BF5493"/>
     <w:rsid w:val="00C43C9E"/>
     <w:rsid w:val="00C637EF"/>
     <w:rsid w:val="00C70B75"/>
+    <w:rsid w:val="00C751A8"/>
     <w:rsid w:val="00C82E2C"/>
     <w:rsid w:val="00C83DE2"/>
     <w:rsid w:val="00C84589"/>
+    <w:rsid w:val="00D7115E"/>
+    <w:rsid w:val="00D943DD"/>
     <w:rsid w:val="00DB107A"/>
+    <w:rsid w:val="00DB5FBB"/>
     <w:rsid w:val="00E90A4E"/>
     <w:rsid w:val="00F83CC4"/>
     <w:rsid w:val="00FC2181"/>

</xml_diff>